<commit_message>
Site updated: 2022-07-02 16:18:32
</commit_message>
<xml_diff>
--- a/科幻小说/220623《三体》/220623《三体》/Blog.docx
+++ b/科幻小说/220623《三体》/220623《三体》/Blog.docx
@@ -3738,7 +3738,16 @@
     </w:p>
     <w:p>
       <w:r>
-        <w:t>“看完那些，你一定想到了三年前因球状闪电研究发现的宏原子，那可是你最辉煌的时代。”汪淼对丁仪说，他们此时正在丁仪家宽散空旷的客厅中，两人都靠在那张台球桌旁边。</w:t>
+        <w:t>“看完那些，你一定想到了三年前因球状闪电研究发现的宏原子，那可是你最辉煌的时代。”汪淼对丁仪说，他们此时正在丁仪家</w:t>
+      </w:r>
+      <w:r>
+        <w:rPr>
+          <w:rFonts w:hint="eastAsia"/>
+        </w:rPr>
+        <w:t>宽敞</w:t>
+      </w:r>
+      <w:r>
+        <w:t>空旷的客厅中，两人都靠在那张台球桌旁边。</w:t>
       </w:r>
       <w:r>
         <w:t>&lt;br /&gt;&lt;br /&gt;</w:t>
@@ -3973,7 +3982,16 @@
         <w:t>淼</w:t>
       </w:r>
       <w:r>
-        <w:t>：“汪院士这辈子还不会闲着，能继续改进刀啊剑啊长矛啊。我他妈的以后干什么？天知道！”说着他把一个空洒瓶扔桌上，捡起台球丢过去砸。</w:t>
+        <w:t>：“汪院士这辈子还不会闲着，能继续改进刀啊剑啊长矛啊。我他妈的以后干什么？天知道！”说着他把一个空</w:t>
+      </w:r>
+      <w:r>
+        <w:rPr>
+          <w:rFonts w:hint="eastAsia"/>
+        </w:rPr>
+        <w:t>酒瓶</w:t>
+      </w:r>
+      <w:r>
+        <w:t>扔桌上，捡起台球丢过去砸。</w:t>
       </w:r>
       <w:r>
         <w:t>&lt;br /&gt;&lt;br /&gt;</w:t>
@@ -4061,7 +4079,25 @@
     </w:p>
     <w:p>
       <w:r>
-        <w:t>车开出了城市，沿京石告诉向西疾驶，刚刚进入河北境内就下了高速公路。大史停下了车，把车里的两人拖出来。丁仪和汪淼一下车，午后灿烂的阳光就令他们眯起了眼，覆盖着麦田的华北大平原在他们面前铺展开。</w:t>
+        <w:t>车开出了城市，沿京石</w:t>
+      </w:r>
+      <w:r>
+        <w:rPr>
+          <w:rFonts w:hint="eastAsia"/>
+        </w:rPr>
+        <w:t>高速</w:t>
+      </w:r>
+      <w:r>
+        <w:t>向西疾驶，刚刚进入河北境内就下了高速公路。大史停下了车，把车里的两人拖出来。丁仪和汪淼</w:t>
+      </w:r>
+      <w:r>
+        <w:rPr>
+          <w:rFonts w:hint="eastAsia"/>
+        </w:rPr>
+        <w:t>一</w:t>
+      </w:r>
+      <w:r>
+        <w:t>下车，午后灿烂的阳光就令他们眯起了眼，覆盖着麦田的华北大平原在他们面前铺展开。</w:t>
       </w:r>
       <w:r>
         <w:t>&lt;br /&gt;&lt;br /&gt;</w:t>
@@ -4146,7 +4182,15 @@
     </w:p>
     <w:p>
       <w:r>
-        <w:t>看看吧，这就是虫子，它们的技术与我们的差距，远大于我们与三体文明的差距。人类竭尽全力消灭它们，用尽各种毒剂，用飞机喷洒，引进和培养它们的天敌，搜寻并毁掉它们的卵，用基因改造使它们绝育；用火烧它们，用水淹它们，每个家庭都有对付它们的灭害灵，每个办公桌下都有像苍蝇拍这种击杀它们的武器……这场漫长的战争伴随着整个人类文明，现在仍然胜负未定，虫子并没有被灭绝，它们照样傲行于天地之间，它们的数量也并不比人类出现前少。把人类看作虫子的三体人似乎忘记了一个事实；虫子从来就没有被真正战胜过。太阳被一小片黑云遮住了，在大地</w:t>
+        <w:t>看看吧，这就是虫子，它们的技术与我们的差距，远大于我们与三体文明的差距。人类竭尽全力消灭它们，用尽各种毒剂，用飞机喷洒，引进和培养它们的天敌，搜寻并毁掉它们的卵，用基因改造使它们绝育；用火烧它们，用水淹它们，每个家庭都有对付它们的灭害灵，每个办公桌下都有像苍蝇拍这种击杀它们的武器……这场漫长的战争伴随着整个人类文明，现在仍然胜负未定，虫子并没有被灭绝，它们照样傲行于天地之间，它们的数量也并不比人类出现前少。把人类看作虫子的三体人似乎忘记了一个事实；虫子从来就没有被真正战胜过。</w:t>
+      </w:r>
+      <w:r>
+        <w:t>&lt;br /&gt;&lt;br /&gt;</w:t>
+      </w:r>
+    </w:p>
+    <w:p>
+      <w:r>
+        <w:t>太阳被一小片黑云遮住了，在大地</w:t>
       </w:r>
       <w:r>
         <w:rPr>
@@ -4300,7 +4344,11 @@
     </w:p>
     <w:p>
       <w:r>
-        <w:t>叶文洁的心脏艰难地跳动着，像一根即将断裂的琴弦，黑雾开始在她的眼前出现，她用尽生命的最后能量坚持着，在一切都没入永恒的黑暗之前，她想再看</w:t>
+        <w:t>叶文洁的心脏艰难地跳动着，像一根即将断裂的琴弦，黑雾开始在她的眼前出现，她用尽生</w:t>
+      </w:r>
+      <w:r>
+        <w:lastRenderedPageBreak/>
+        <w:t>命的最后能量坚持着，在一切都没入永恒的黑暗之前，她想再看</w:t>
       </w:r>
       <w:r>
         <w:rPr>
@@ -4312,11 +4360,7 @@
         <w:t>次红岸基地的日落。</w:t>
       </w:r>
       <w:r>
-        <w:t xml:space="preserve">&lt;br </w:t>
-      </w:r>
-      <w:r>
-        <w:lastRenderedPageBreak/>
-        <w:t>/&gt;&lt;br /&gt;</w:t>
+        <w:t>&lt;br /&gt;&lt;br /&gt;</w:t>
       </w:r>
     </w:p>
     <w:p>
@@ -4365,15 +4409,33 @@
     </w:p>
     <w:p>
       <w:r>
-        <w:t>如果存在外星文明，那么字宙中有共同的道德准则吗？往小处说，这是科幻迷们很感兴趣的一个问题；往大处说，它可能关乎人类文明的生死存亡。</w:t>
-      </w:r>
-      <w:r>
-        <w:t>&lt;br /&gt;&lt;br /&gt;</w:t>
-      </w:r>
-    </w:p>
-    <w:p>
-      <w:r>
-        <w:t>二十世纪八十年代的国内科幻作家们是倾向于肯定的回答的，那时的科幻小说中，外星人都以慈眉善目的形象出现，以天父般的仁慈和宽容，指引着人类这群迷途的羔羊。金涛的《月光岛》中，外星人抚慰着人类受伤的心灵；童思正《遥远的爱》中人类与外星人的爱情凄美而壮丽；郑文光的《她球镜像》中，人类道德的低下，甚至把技术永平高出几个数量级但却怀有菩萨心肠的外星文明吓跑了！</w:t>
+        <w:t>如果存在外星文明，那么</w:t>
+      </w:r>
+      <w:r>
+        <w:rPr>
+          <w:rFonts w:hint="eastAsia"/>
+        </w:rPr>
+        <w:t>宇宙</w:t>
+      </w:r>
+      <w:r>
+        <w:t>中有共同的道德准则吗？往小处说，这是科幻迷们很感兴趣的一个问题；往大处说，它可能关乎人类文明的生死存亡。</w:t>
+      </w:r>
+      <w:r>
+        <w:t>&lt;br /&gt;&lt;br /&gt;</w:t>
+      </w:r>
+    </w:p>
+    <w:p>
+      <w:r>
+        <w:t>二十世纪八十年代的国内科幻作家们是倾向于肯定的回答的，那时的科幻小说中，外星人都以慈眉善目的形象出现，以天父般的仁慈和宽容，指引着人类这群迷途的羔羊。金涛的《月光岛》中，外星人抚慰着人类受伤的心灵；童思正《遥远的爱》中人类与外星人的爱情凄美而壮丽；郑文光的《</w:t>
+      </w:r>
+      <w:r>
+        <w:rPr>
+          <w:rFonts w:hint="eastAsia"/>
+        </w:rPr>
+        <w:t>地球</w:t>
+      </w:r>
+      <w:r>
+        <w:t>镜像》中，人类道德的低下，甚至把技术永平高出几个数量级但却怀有菩萨心肠的外星文明吓跑了！</w:t>
       </w:r>
       <w:r>
         <w:t>&lt;br /&gt;&lt;br /&gt;</w:t>
@@ -4431,7 +4493,16 @@
     </w:p>
     <w:p>
       <w:r>
-        <w:t>当然，《三体》并没有揭示那个宇宙文明的图景，其中的两大文明己也没有意识到这个图景，只是揭开了其面纱的一角。比如，既然距我们最近的恒星都有智慧文明，那这个宇宙一定是十分拥挤的，可为什么它看起来却如此空旷？但愿有机会在《地球往事》的第二部中继续描述。</w:t>
+        <w:t>当然，《三体》并没有揭示那个宇宙文明的图景，其中的两大文明</w:t>
+      </w:r>
+      <w:r>
+        <w:rPr>
+          <w:rFonts w:hint="eastAsia"/>
+        </w:rPr>
+        <w:t>自己</w:t>
+      </w:r>
+      <w:r>
+        <w:t>也没有意识到这个图景，只是揭开了其面纱的一角。比如，既然距我们最近的恒星都有智慧文明，那这个宇宙一定是十分拥挤的，可为什么它看起来却如此空旷？但愿有机会在《地球往事》的第二部中继续描述。</w:t>
       </w:r>
       <w:r>
         <w:t>&lt;br /&gt;&lt;br /&gt;</w:t>
@@ -4447,11 +4518,8 @@
     </w:p>
     <w:p>
       <w:r>
-        <w:t>从《三体》连载中得知，国内科幻读者喜欢描述宇宙终极图景的科幻小说，这多少让人感到</w:t>
-      </w:r>
-      <w:r>
         <w:lastRenderedPageBreak/>
-        <w:t>有些意外。我是从八十年代的科幻高潮中过来的，个人认为那时的作家们创造了真正的、以后再也没有成规模出现过的中国式科幻，这种科幻最显著的特点就是完全技术细节化，没有形而上的影子。而现在的科幻迷们已经打开了天眼，用思想拥抱整个宇宙了。这也对科幻小说作者提出了更高的要求，很遗憾《三体》不是这样的"终极科幻小说"。创作《2001》式的科幻是很难的，特别是长篇，很容易成为既无小说的生动，又无科普的正确，更无论文的严谨的一堆空架子，笔者对此</w:t>
+        <w:t>从《三体》连载中得知，国内科幻读者喜欢描述宇宙终极图景的科幻小说，这多少让人感到有些意外。我是从八十年代的科幻高潮中过来的，个人认为那时的作家们创造了真正的、以后再也没有成规模出现过的中国式科幻，这种科幻最显著的特点就是完全技术细节化，没有形而上的影子。而现在的科幻迷们已经打开了天眼，用思想拥抱整个宇宙了。这也对科幻小说作者提出了更高的要求，很遗憾《三体》不是这样的"终极科幻小说"。创作《2001》式的科幻是很难的，特别是长篇，很容易成为既无小说的生动，又无科普的正确，更无论文的严谨的一堆空架子，笔者对此</w:t>
       </w:r>
       <w:r>
         <w:rPr>
@@ -4465,7 +4533,34 @@
     </w:p>
     <w:p>
       <w:r>
-        <w:t>哦，这个设想中的系列叫《地球往事》，没有太多的意思，科幻与其他幻想文学的区别就在于它与其实还牵着一根细线，这就使它成为现代神话而不是重话(古代神话在当时的读者心中是其实的)。所以我一直认为，好看的科幻小说应该是把最空灵最疯狂的想象写得像新闻报道一般真实。往事的回忆总是真实的，自己希望把小说写得像是历史学家对过去的真实记叙，但能不能做到，就是另一回事了。</w:t>
+        <w:t>哦，这个设想中的系列叫《地球往事》，没有太多的意思，科幻与其他幻想文学的区别就在于它与</w:t>
+      </w:r>
+      <w:r>
+        <w:rPr>
+          <w:rFonts w:hint="eastAsia"/>
+        </w:rPr>
+        <w:t>真实</w:t>
+      </w:r>
+      <w:r>
+        <w:t>还牵着一根细线，这就使它成为现代神话而不是</w:t>
+      </w:r>
+      <w:r>
+        <w:rPr>
+          <w:rFonts w:hint="eastAsia"/>
+        </w:rPr>
+        <w:t>童话</w:t>
+      </w:r>
+      <w:r>
+        <w:t>(古代神话在当时的读者心中是</w:t>
+      </w:r>
+      <w:r>
+        <w:rPr>
+          <w:rFonts w:hint="eastAsia"/>
+        </w:rPr>
+        <w:t>真实</w:t>
+      </w:r>
+      <w:r>
+        <w:t>的)。所以我一直认为，好看的科幻小说应该是把最空灵最疯狂的想象写得像新闻报道一般真实。往事的回忆总是真实的，自己希望把小说写得像是历史学家对过去的真实记叙，但能不能做到，就是另一回事了。</w:t>
       </w:r>
       <w:r>
         <w:t>&lt;br /&gt;&lt;br /&gt;</w:t>

</xml_diff>